<commit_message>
W5 also updated Sept 28 2026
</commit_message>
<xml_diff>
--- a/lectures/week05/Week5_Lecture.docx
+++ b/lectures/week05/Week5_Lecture.docx
@@ -265,7 +265,7 @@
         <w:jc w:val="both"/>
       </w:pPr>
       <w:r>
-        <w:t>That asymmetry is the argument. If the invariant lives in hand coordinates and not joint coordinates, the reasoning goes, then hand coordinates are where the planning happens (Figure 1).</w:t>
+        <w:t>That asymmetry is the argument. If the regularity appears in hand coordinates and not in joint coordinates, the reasoning goes, then the brain plans in hand coordinates. Figure 1 shows what one hand-coordinate model, minimum jerk, predicts for the reaches used throughout this week.</w:t>
       </w:r>
     </w:p>
     <w:p>
@@ -354,19 +354,19 @@
           <w:b/>
           <w:bCs/>
         </w:rPr>
-        <w:t xml:space="preserve">Read that figure carefully, because the temptation is to over-read it. </w:t>
-      </w:r>
-      <w:r>
-        <w:t xml:space="preserve">It shows what a model predicts, not what a person does. And the empirical claim is weaker than the model: Morasso reported hand paths that are approximately straight, and later work documented systematic curvature that varies with direction and workspace location (Atkeson &amp; Hollerbach 1985 for movements in the vertical plane; Flash 1987 in the horizontal plane). Reaching is not straight. It is straight-ish, with structure in the deviations.</w:t>
-      </w:r>
-    </w:p>
-    <w:p>
-      <w:pPr>
-        <w:spacing w:after="160" w:line="300" w:lineRule="auto"/>
-        <w:jc w:val="both"/>
-      </w:pPr>
-      <w:r>
-        <w:t>Keep that in mind through §3 and §6, where the deviations turn out to matter more than the straightness.</w:t>
+        <w:t xml:space="preserve">Figure 1 is not evidence that people reach in straight lines. </w:t>
+      </w:r>
+      <w:r>
+        <w:t xml:space="preserve">Its hand paths are straight because the model defines them that way. Morasso reported paths that were only approximately straight, and later studies found systematic curvature that changes with reach direction and with where in the workspace the reach is made (Atkeson &amp; Hollerbach 1985 in the vertical plane; Flash 1987 in the horizontal plane). Real reaches are close to straight, and their small deviations follow a pattern.</w:t>
+      </w:r>
+    </w:p>
+    <w:p>
+      <w:pPr>
+        <w:spacing w:after="160" w:line="300" w:lineRule="auto"/>
+        <w:jc w:val="both"/>
+      </w:pPr>
+      <w:r>
+        <w:t>Keep those deviations in mind. In §3 and §6 they matter more than the straightness does.</w:t>
       </w:r>
     </w:p>
     <w:p>

</xml_diff>

<commit_message>
W5 updated Sept 29 2026
</commit_message>
<xml_diff>
--- a/lectures/week05/Week5_Lecture.docx
+++ b/lectures/week05/Week5_Lecture.docx
@@ -270,6 +270,7 @@
     </w:p>
     <w:p>
       <w:pPr>
+        <w:keepNext/>
         <w:spacing w:before="200" w:after="80"/>
         <w:jc w:val="center"/>
       </w:pPr>
@@ -320,6 +321,7 @@
     </w:p>
     <w:p>
       <w:pPr>
+        <w:keepLines/>
         <w:spacing w:after="200" w:line="260" w:lineRule="auto"/>
         <w:jc w:val="both"/>
       </w:pPr>
@@ -587,6 +589,7 @@
     </w:p>
     <w:p>
       <w:pPr>
+        <w:keepNext/>
         <w:spacing w:before="200" w:after="80"/>
         <w:jc w:val="center"/>
       </w:pPr>
@@ -636,6 +639,7 @@
     </w:p>
     <w:p>
       <w:pPr>
+        <w:keepLines/>
         <w:spacing w:after="200" w:line="260" w:lineRule="auto"/>
         <w:jc w:val="both"/>
       </w:pPr>
@@ -733,94 +737,53 @@
           <w:b/>
           <w:bCs/>
         </w:rPr>
-        <w:t xml:space="preserve">One methodological point first, because it changes the answer. </w:t>
-      </w:r>
-      <w:r>
-        <w:t xml:space="preserve">Week 4 Task B.2 established that </w:t>
-      </w:r>
-      <w:r>
-        <w:rPr>
-          <w:i/>
-          <w:iCs/>
-        </w:rPr>
-        <w:t>lambda_for_posture</w:t>
-      </w:r>
-      <w:r>
-        <w:t xml:space="preserve"> does not hold the posture it names — assign thresholds that way and the arm settles </w:t>
-      </w:r>
-      <w:r>
-        <w:rPr>
-          <w:b/>
-          <w:bCs/>
-        </w:rPr>
-        <w:t>2.3 cm</w:t>
-      </w:r>
-      <w:r>
-        <w:t xml:space="preserve"> from where you asked. Task B.3 replaced it with </w:t>
-      </w:r>
-      <w:r>
-        <w:rPr>
-          <w:i/>
-          <w:iCs/>
-        </w:rPr>
-        <w:t>lambda_for_equilibrium</w:t>
-      </w:r>
-      <w:r>
-        <w:t xml:space="preserve">, which inverts the map. Every EPH reach in these notes uses the corrected solver, and every endpoint lands within </w:t>
-      </w:r>
-      <w:r>
-        <w:rPr>
-          <w:b/>
-          <w:bCs/>
-        </w:rPr>
-        <w:t>0.023 cm</w:t>
-      </w:r>
-      <w:r>
-        <w:t xml:space="preserve"> of its target. Had we used the naive version, mean curvature would read </w:t>
-      </w:r>
-      <w:r>
-        <w:rPr>
-          <w:b/>
-          <w:bCs/>
-        </w:rPr>
-        <w:t>1.17 cm</w:t>
-      </w:r>
-      <w:r>
-        <w:t xml:space="preserve"> instead of </w:t>
-      </w:r>
-      <w:r>
-        <w:rPr>
-          <w:b/>
-          <w:bCs/>
-        </w:rPr>
-        <w:t>0.84 cm</w:t>
-      </w:r>
-      <w:r>
-        <w:t xml:space="preserve"> — a 39% overstatement — and the direction pattern would be scrambled, with the 225° reach showing </w:t>
-      </w:r>
-      <w:r>
-        <w:rPr>
-          <w:b/>
-          <w:bCs/>
-        </w:rPr>
-        <w:t>1.12 cm</w:t>
-      </w:r>
-      <w:r>
-        <w:t xml:space="preserve"> rather than </w:t>
-      </w:r>
-      <w:r>
-        <w:rPr>
-          <w:b/>
-          <w:bCs/>
-        </w:rPr>
-        <w:t>0.11 cm</w:t>
-      </w:r>
-      <w:r>
-        <w:t>. A systematic solver bias is indistinguishable from a biomechanical effect unless you check the endpoints. With that settled, the two models can be put on the same eight targets (Figure 3).</w:t>
-      </w:r>
-    </w:p>
-    <w:p>
-      <w:pPr>
+        <w:t xml:space="preserve">One methodological point first. </w:t>
+      </w:r>
+      <w:r>
+        <w:t xml:space="preserve">Under threshold control, the controller does not tell the arm where to go. It sets a threshold for each of the six muscles, and the arm comes to rest wherever the torques of the six muscles cancel. Getting the arm to rest exactly on a target therefore takes some care.</w:t>
+      </w:r>
+    </w:p>
+    <w:p>
+      <w:pPr>
+        <w:spacing w:after="160" w:line="300" w:lineRule="auto"/>
+        <w:jc w:val="both"/>
+      </w:pPr>
+      <w:r>
+        <w:t xml:space="preserve">The obvious recipe misses (Lab 04 Task B.2). It sets each muscle’s threshold from that muscle’s length when the arm is at the target, so the torques should cancel there. They do not quite. The two muscles that cross both joints pull on the shoulder with different leverage, 2.5 cm for one and 4.0 cm for the other, and some shoulder torque is left over. The arm rotates at the shoulder until the torques cancel, and the hand stops about </w:t>
+      </w:r>
+      <w:r>
+        <w:rPr>
+          <w:b/>
+          <w:bCs/>
+        </w:rPr>
+        <w:t xml:space="preserve">2.3 cm</w:t>
+      </w:r>
+      <w:r>
+        <w:t xml:space="preserve"> from the target.</w:t>
+      </w:r>
+    </w:p>
+    <w:p>
+      <w:pPr>
+        <w:spacing w:after="160" w:line="300" w:lineRule="auto"/>
+        <w:jc w:val="both"/>
+      </w:pPr>
+      <w:r>
+        <w:t xml:space="preserve">The fix is to aim off-target, as an archer aims into a crosswind (Lab 04 Task B.3). The corrected method sets the thresholds for a slightly different posture, chosen so that the arm comes to rest exactly on the target. Every EPH reach in these notes uses the corrected method, and every reach ends within </w:t>
+      </w:r>
+      <w:r>
+        <w:rPr>
+          <w:b/>
+          <w:bCs/>
+        </w:rPr>
+        <w:t xml:space="preserve">0.023 cm</w:t>
+      </w:r>
+      <w:r>
+        <w:t xml:space="preserve"> of its target. Lab 05 Task B.2 runs the same reaches with the obvious recipe, so you can see how a method that misses its targets distorts the curvature measurements. With that settled, the two models can be put on the same eight targets (Figure 3).</w:t>
+      </w:r>
+    </w:p>
+    <w:p>
+      <w:pPr>
+        <w:keepNext/>
         <w:spacing w:before="200" w:after="80"/>
         <w:jc w:val="center"/>
       </w:pPr>
@@ -832,7 +795,7 @@
           <wp:inline distT="0" distB="0" distL="0" distR="0" wp14:anchorId="0521C3C2" wp14:editId="7B5FA4E4">
             <wp:extent cx="6115050" cy="2924175"/>
             <wp:effectExtent l="0" t="0" r="0" b="0"/>
-            <wp:docPr id="2129888648" name="Figure 3" descr="Eight center-out reaches under each model. Left: λ control, C = 0.25, 350 ms constant-rate ramp, thresholds solved with lambda_for_equilibrium — mean curvature 0.84 cm, every endpoint within 0.023 cm of target (crosses). Right: minimum jerk, T = 500 ms, straight by construction. Colors identify direction; dots mark where each movement ended." title="Figure 3"/>
+            <wp:docPr id="2129888648" name="Figure 3" descr="Eight center-out reaches under each model. Left: λ control, C = 0.25, 350 ms constant-rate ramp, thresholds set with the corrected method described above — mean curvature 0.84 cm, every endpoint within 0.023 cm of target (crosses). Right: minimum jerk, T = 500 ms, straight by construction. Colors identify direction; dots mark where each movement ended." title="Figure 3"/>
             <wp:cNvGraphicFramePr>
               <a:graphicFrameLocks xmlns:a="http://schemas.openxmlformats.org/drawingml/2006/main" noChangeAspect="1"/>
             </wp:cNvGraphicFramePr>
@@ -870,6 +833,7 @@
     </w:p>
     <w:p>
       <w:pPr>
+        <w:keepLines/>
         <w:spacing w:after="200" w:line="260" w:lineRule="auto"/>
         <w:jc w:val="both"/>
       </w:pPr>
@@ -891,7 +855,7 @@
           <w:sz w:val="18"/>
           <w:szCs w:val="18"/>
         </w:rPr>
-        <w:t xml:space="preserve">Eight center-out reaches under each model. Left: λ control, C = 0.25, 350 ms constant-rate ramp, thresholds solved with lambda_for_equilibrium — mean curvature 0.84 cm, every endpoint within 0.023 cm of target (crosses). Right: minimum jerk, T = 500 ms, straight by construction. Colors identify direction; dots mark where each movement ended.</w:t>
+        <w:t xml:space="preserve">Eight center-out reaches under each model. Left: λ control, C = 0.25, 350 ms constant-rate ramp, thresholds set with the corrected method described above — mean curvature 0.84 cm, every endpoint within 0.023 cm of target (crosses). Right: minimum jerk, T = 500 ms, straight by construction. Colors identify direction; dots mark where each movement ended.</w:t>
       </w:r>
     </w:p>
     <w:p>
@@ -937,7 +901,7 @@
         <w:t>0.11 cm</w:t>
       </w:r>
       <w:r>
-        <w:t xml:space="preserve"> at 225°. Minimum jerk is straight everywhere, to numerical precision. The mechanism behind the EPH curvature is geometric: a constant-rate shift in threshold space maps through the arm's nonlinear Jacobian differently at each configuration, so equal steps in λ are not equal steps in hand space. This is the workspace dependence demonstrated in Week 4 §8, Figure 12, and in Lab 04 Task D.6.</w:t>
+        <w:t xml:space="preserve"> at 225°. Minimum jerk is straight everywhere, to numerical precision. Why EPH curves is taken up in §6. One candidate is geometric: Week 4 §8 showed that a straight line in threshold space need not map to a straight line in hand space. §6 measures how much of this curvature that explains.</w:t>
       </w:r>
     </w:p>
     <w:p>
@@ -961,7 +925,7 @@
         <w:jc w:val="both"/>
       </w:pPr>
       <w:r>
-        <w:t>The obvious reading is that minimum jerk matches reality and EPH does not. That reading is too quick, for three reasons worth separating.</w:t>
+        <w:t>The obvious reading is that minimum jerk matches reality and EPH does not. That reading is too quick, for three reasons.</w:t>
       </w:r>
     </w:p>
     <w:p>
@@ -995,7 +959,7 @@
         <w:t xml:space="preserve">Second, the comparison is not yet like-for-like. </w:t>
       </w:r>
       <w:r>
-        <w:t xml:space="preserve">The left panel is a simulation: six muscles, Lagrangian dynamics, a hand path that emerged. The right panel is a specification — a curve we wrote down. Of course the specification is straight. §6 fixes this by making the specification drive the muscles, and the fix changes the conclusion.</w:t>
+        <w:t xml:space="preserve">The left panel is a simulation: six muscles pull on a two-link arm, the arm’s equations of motion carry it forward in time, and the hand path emerges. The right panel is a specification — a curve we wrote down. Of course the specification is straight. §6 fixes this by making the specification drive the muscles, and the fix changes the conclusion.</w:t>
       </w:r>
     </w:p>
     <w:p>
@@ -1109,7 +1073,7 @@
         <w:t xml:space="preserve">V̇ = α(−V + T − P)</w:t>
       </w:r>
       <w:r>
-        <w:t xml:space="preserve">. It is a low-pass filtered copy of T − P, not T − P itself. This matters: V is the integrator, which is what “Vector Integration To Endpoint” names.</w:t>
+        <w:t xml:space="preserve">. It is a low-pass filtered copy of T − P, not T − P itself. The integrator is P, which accumulates the gated difference vector until it reaches the target; that is what “Vector Integration To Endpoint” names.</w:t>
       </w:r>
     </w:p>
     <w:p>
@@ -1211,33 +1175,7 @@
         <w:t>The GO gate G(t)</w:t>
       </w:r>
       <w:r>
-        <w:t xml:space="preserve"> — a scalar that decides when the plan unrolls and how fast. It rises from zero at movement onset.</w:t>
-      </w:r>
-    </w:p>
-    <w:p>
-      <w:pPr>
-        <w:spacing w:after="160" w:line="300" w:lineRule="auto"/>
-        <w:jc w:val="both"/>
-      </w:pPr>
-      <w:r>
-        <w:rPr>
-          <w:b/>
-          <w:bCs/>
-        </w:rPr>
-        <w:t xml:space="preserve">Notice where the gate sits. </w:t>
-      </w:r>
-      <w:r>
-        <w:t xml:space="preserve">It multiplies the </w:t>
-      </w:r>
-      <w:r>
-        <w:rPr>
-          <w:i/>
-          <w:iCs/>
-        </w:rPr>
-        <w:t>output</w:t>
-      </w:r>
-      <w:r>
-        <w:t>, not the input. That placement is the entire model, and it is why the circuit produces a bell.</w:t>
+        <w:t xml:space="preserve"> — a scalar that decides when the plan unrolls and how fast. It starts at zero when the movement is triggered and rises smoothly to a ceiling G₀:</w:t>
       </w:r>
     </w:p>
     <w:p>
@@ -1252,38 +1190,88 @@
           <w:sz w:val="23"/>
           <w:szCs w:val="23"/>
         </w:rPr>
-        <w:t>Ṗ = G(t) · V        with G rising from zero and |V| shrinking toward zero</w:t>
-      </w:r>
-    </w:p>
-    <w:p>
-      <w:pPr>
-        <w:spacing w:after="160" w:line="300" w:lineRule="auto"/>
-        <w:jc w:val="both"/>
-      </w:pPr>
-      <w:r>
-        <w:rPr>
-          <w:b/>
-          <w:bCs/>
-        </w:rPr>
-        <w:t xml:space="preserve">Speed is the product of a rising factor and a falling factor. </w:t>
-      </w:r>
-      <w:r>
-        <w:t xml:space="preserve">Early in the movement the difference vector is large but the gate is nearly shut, so the hand barely moves. Late in the movement the gate is wide open but the difference vector has collapsed, so the hand barely moves. In between, both are appreciable, and speed peaks. Neither factor is bell-shaped. The bell belongs to neither of them.</w:t>
-      </w:r>
-    </w:p>
-    <w:p>
-      <w:pPr>
-        <w:spacing w:after="160" w:line="300" w:lineRule="auto"/>
-        <w:jc w:val="both"/>
-      </w:pPr>
-      <w:r>
-        <w:t xml:space="preserve">This is what Bullock and Grossberg mean by </w:t>
+        <w:t xml:space="preserve">G(t) = G₀ t² / (β + t²)</w:t>
+      </w:r>
+    </w:p>
+    <w:p>
+      <w:pPr>
+        <w:spacing w:after="160" w:line="300" w:lineRule="auto"/>
+        <w:jc w:val="both"/>
+      </w:pPr>
+      <w:r>
+        <w:t xml:space="preserve">The t² makes the onset faster than linear. While t² is small next to β, the gate grows as G₀t²/β: it starts with zero slope and speeds up. It keeps accelerating until t = √(β/3), about 220 ms, and then levels off toward the ceiling G₀. The constant β sets the timing; the gate is half open at t = √β, about 390 ms. Bullock and Grossberg (1988, p. 71) compare gates of this form with different powers of t; these notes use the square. The values G₀ = 30 s⁻¹, β = 0.15 s² and α = 30 s⁻¹ were chosen for these notes so that an 8 cm reach takes about 370 ms. Figure 4c shows what the gradual onset does to the speed profile.</w:t>
+      </w:r>
+    </w:p>
+    <w:p>
+      <w:pPr>
+        <w:spacing w:after="160" w:line="300" w:lineRule="auto"/>
+        <w:jc w:val="both"/>
+      </w:pPr>
+      <w:r>
+        <w:rPr>
+          <w:b/>
+          <w:bCs/>
+        </w:rPr>
+        <w:t xml:space="preserve">Notice where the gate sits. </w:t>
+      </w:r>
+      <w:r>
+        <w:t xml:space="preserve">It multiplies the </w:t>
       </w:r>
       <w:r>
         <w:rPr>
           <w:i/>
           <w:iCs/>
         </w:rPr>
+        <w:t>output</w:t>
+      </w:r>
+      <w:r>
+        <w:t>, not the input. That placement is the entire model, and it is why the circuit produces a bell.</w:t>
+      </w:r>
+    </w:p>
+    <w:p>
+      <w:pPr>
+        <w:spacing w:before="140" w:after="180"/>
+        <w:jc w:val="center"/>
+      </w:pPr>
+      <w:r>
+        <w:rPr>
+          <w:i/>
+          <w:iCs/>
+          <w:sz w:val="23"/>
+          <w:szCs w:val="23"/>
+        </w:rPr>
+        <w:t>Ṗ = G(t) · V        with G rising from zero and |V| shrinking toward zero</w:t>
+      </w:r>
+    </w:p>
+    <w:p>
+      <w:pPr>
+        <w:spacing w:after="160" w:line="300" w:lineRule="auto"/>
+        <w:jc w:val="both"/>
+      </w:pPr>
+      <w:r>
+        <w:rPr>
+          <w:b/>
+          <w:bCs/>
+        </w:rPr>
+        <w:t xml:space="preserve">Speed is the product of a rising factor and a falling factor. </w:t>
+      </w:r>
+      <w:r>
+        <w:t xml:space="preserve">Early in the movement the difference vector is large but the gate is nearly shut, so the hand barely moves. Late in the movement the gate is wide open but the difference vector has collapsed, so the hand barely moves. In between, both are appreciable, and speed peaks. Neither factor is bell-shaped. The bell belongs to neither of them.</w:t>
+      </w:r>
+    </w:p>
+    <w:p>
+      <w:pPr>
+        <w:spacing w:after="160" w:line="300" w:lineRule="auto"/>
+        <w:jc w:val="both"/>
+      </w:pPr>
+      <w:r>
+        <w:t xml:space="preserve">This is what Bullock and Grossberg mean by </w:t>
+      </w:r>
+      <w:r>
+        <w:rPr>
+          <w:i/>
+          <w:iCs/>
+        </w:rPr>
         <w:t>emergent invariants</w:t>
       </w:r>
       <w:r>
@@ -1292,6 +1280,7 @@
     </w:p>
     <w:p>
       <w:pPr>
+        <w:keepNext/>
         <w:spacing w:before="200" w:after="80"/>
         <w:jc w:val="center"/>
       </w:pPr>
@@ -1341,6 +1330,7 @@
     </w:p>
     <w:p>
       <w:pPr>
+        <w:keepLines/>
         <w:spacing w:after="200" w:line="260" w:lineRule="auto"/>
         <w:jc w:val="both"/>
       </w:pPr>
@@ -1376,6 +1366,7 @@
     </w:p>
     <w:p>
       <w:pPr>
+        <w:keepNext/>
         <w:spacing w:before="200" w:after="80"/>
         <w:jc w:val="center"/>
       </w:pPr>
@@ -1425,6 +1416,7 @@
     </w:p>
     <w:p>
       <w:pPr>
+        <w:keepLines/>
         <w:spacing w:after="200" w:line="260" w:lineRule="auto"/>
         <w:jc w:val="both"/>
       </w:pPr>
@@ -1468,6 +1460,7 @@
     </w:p>
     <w:p>
       <w:pPr>
+        <w:keepNext/>
         <w:spacing w:before="200" w:after="80"/>
         <w:jc w:val="center"/>
       </w:pPr>
@@ -1517,6 +1510,7 @@
     </w:p>
     <w:p>
       <w:pPr>
+        <w:keepLines/>
         <w:spacing w:after="200" w:line="260" w:lineRule="auto"/>
         <w:jc w:val="both"/>
       </w:pPr>
@@ -1583,7 +1577,7 @@
         <w:t xml:space="preserve">A note for readers of the paper. </w:t>
       </w:r>
       <w:r>
-        <w:t>Two differences in notation, one of which is easy to get wrong. First, their DV is the filtered integrator variable V, not the instantaneous difference T − P; if you see “DV” in the paper, it is our V.</w:t>
+        <w:t>Two differences in notation, one of which is easy to get wrong. First, their DV is our filtered variable V, not the instantaneous difference T − P; if you see “DV” in the paper, it is our V.</w:t>
       </w:r>
     </w:p>
     <w:p>
@@ -1698,6 +1692,7 @@
     </w:p>
     <w:p>
       <w:pPr>
+        <w:keepNext/>
         <w:spacing w:before="200" w:after="80"/>
         <w:jc w:val="center"/>
       </w:pPr>
@@ -1747,6 +1742,7 @@
     </w:p>
     <w:p>
       <w:pPr>
+        <w:keepLines/>
         <w:spacing w:after="200" w:line="260" w:lineRule="auto"/>
         <w:jc w:val="both"/>
       </w:pPr>
@@ -1803,6 +1799,9 @@
             <w:bottom w:w="0" w:type="dxa"/>
           </w:tblCellMar>
         </w:tblPrEx>
+        <w:trPr>
+          <w:cantSplit/>
+        </w:trPr>
         <w:tc>
           <w:tcPr>
             <w:tcW w:w="1200" w:type="dxa"/>
@@ -1816,6 +1815,7 @@
           </w:tcPr>
           <w:p>
             <w:pPr>
+              <w:keepNext/>
               <w:spacing w:line="250" w:lineRule="auto"/>
             </w:pPr>
             <w:r>
@@ -1842,6 +1842,7 @@
           </w:tcPr>
           <w:p>
             <w:pPr>
+              <w:keepNext/>
               <w:spacing w:line="250" w:lineRule="auto"/>
             </w:pPr>
             <w:r>
@@ -1868,6 +1869,7 @@
           </w:tcPr>
           <w:p>
             <w:pPr>
+              <w:keepNext/>
               <w:spacing w:line="250" w:lineRule="auto"/>
             </w:pPr>
             <w:r>
@@ -1894,6 +1896,7 @@
           </w:tcPr>
           <w:p>
             <w:pPr>
+              <w:keepNext/>
               <w:spacing w:line="250" w:lineRule="auto"/>
             </w:pPr>
             <w:r>
@@ -1920,6 +1923,7 @@
           </w:tcPr>
           <w:p>
             <w:pPr>
+              <w:keepNext/>
               <w:spacing w:line="250" w:lineRule="auto"/>
             </w:pPr>
             <w:r>
@@ -1946,6 +1950,7 @@
           </w:tcPr>
           <w:p>
             <w:pPr>
+              <w:keepNext/>
               <w:spacing w:line="250" w:lineRule="auto"/>
             </w:pPr>
             <w:r>
@@ -1967,6 +1972,9 @@
             <w:bottom w:w="0" w:type="dxa"/>
           </w:tblCellMar>
         </w:tblPrEx>
+        <w:trPr>
+          <w:cantSplit/>
+        </w:trPr>
         <w:tc>
           <w:tcPr>
             <w:tcW w:w="1200" w:type="dxa"/>
@@ -1979,6 +1987,7 @@
           </w:tcPr>
           <w:p>
             <w:pPr>
+              <w:keepNext/>
               <w:spacing w:line="250" w:lineRule="auto"/>
             </w:pPr>
             <w:r>
@@ -2002,6 +2011,7 @@
           </w:tcPr>
           <w:p>
             <w:pPr>
+              <w:keepNext/>
               <w:spacing w:line="250" w:lineRule="auto"/>
             </w:pPr>
             <w:r>
@@ -2025,6 +2035,7 @@
           </w:tcPr>
           <w:p>
             <w:pPr>
+              <w:keepNext/>
               <w:spacing w:line="250" w:lineRule="auto"/>
             </w:pPr>
             <w:r>
@@ -2048,6 +2059,7 @@
           </w:tcPr>
           <w:p>
             <w:pPr>
+              <w:keepNext/>
               <w:spacing w:line="250" w:lineRule="auto"/>
             </w:pPr>
             <w:r>
@@ -2071,6 +2083,7 @@
           </w:tcPr>
           <w:p>
             <w:pPr>
+              <w:keepNext/>
               <w:spacing w:line="250" w:lineRule="auto"/>
             </w:pPr>
             <w:r>
@@ -2094,6 +2107,7 @@
           </w:tcPr>
           <w:p>
             <w:pPr>
+              <w:keepNext/>
               <w:spacing w:line="250" w:lineRule="auto"/>
             </w:pPr>
             <w:r>
@@ -2113,6 +2127,9 @@
             <w:bottom w:w="0" w:type="dxa"/>
           </w:tblCellMar>
         </w:tblPrEx>
+        <w:trPr>
+          <w:cantSplit/>
+        </w:trPr>
         <w:tc>
           <w:tcPr>
             <w:tcW w:w="1200" w:type="dxa"/>
@@ -2125,6 +2142,7 @@
           </w:tcPr>
           <w:p>
             <w:pPr>
+              <w:keepNext/>
               <w:spacing w:line="250" w:lineRule="auto"/>
             </w:pPr>
             <w:r>
@@ -2148,6 +2166,7 @@
           </w:tcPr>
           <w:p>
             <w:pPr>
+              <w:keepNext/>
               <w:spacing w:line="250" w:lineRule="auto"/>
             </w:pPr>
             <w:r>
@@ -2171,6 +2190,7 @@
           </w:tcPr>
           <w:p>
             <w:pPr>
+              <w:keepNext/>
               <w:spacing w:line="250" w:lineRule="auto"/>
             </w:pPr>
             <w:r>
@@ -2194,6 +2214,7 @@
           </w:tcPr>
           <w:p>
             <w:pPr>
+              <w:keepNext/>
               <w:spacing w:line="250" w:lineRule="auto"/>
             </w:pPr>
             <w:r>
@@ -2217,6 +2238,7 @@
           </w:tcPr>
           <w:p>
             <w:pPr>
+              <w:keepNext/>
               <w:spacing w:line="250" w:lineRule="auto"/>
             </w:pPr>
             <w:r>
@@ -2240,6 +2262,7 @@
           </w:tcPr>
           <w:p>
             <w:pPr>
+              <w:keepNext/>
               <w:spacing w:line="250" w:lineRule="auto"/>
             </w:pPr>
             <w:r>
@@ -2259,6 +2282,9 @@
             <w:bottom w:w="0" w:type="dxa"/>
           </w:tblCellMar>
         </w:tblPrEx>
+        <w:trPr>
+          <w:cantSplit/>
+        </w:trPr>
         <w:tc>
           <w:tcPr>
             <w:tcW w:w="1200" w:type="dxa"/>
@@ -2271,6 +2297,7 @@
           </w:tcPr>
           <w:p>
             <w:pPr>
+              <w:keepNext/>
               <w:spacing w:line="250" w:lineRule="auto"/>
             </w:pPr>
             <w:r>
@@ -2294,6 +2321,7 @@
           </w:tcPr>
           <w:p>
             <w:pPr>
+              <w:keepNext/>
               <w:spacing w:line="250" w:lineRule="auto"/>
             </w:pPr>
             <w:r>
@@ -2317,6 +2345,7 @@
           </w:tcPr>
           <w:p>
             <w:pPr>
+              <w:keepNext/>
               <w:spacing w:line="250" w:lineRule="auto"/>
             </w:pPr>
             <w:r>
@@ -2340,6 +2369,7 @@
           </w:tcPr>
           <w:p>
             <w:pPr>
+              <w:keepNext/>
               <w:spacing w:line="250" w:lineRule="auto"/>
             </w:pPr>
             <w:r>
@@ -2363,6 +2393,7 @@
           </w:tcPr>
           <w:p>
             <w:pPr>
+              <w:keepNext/>
               <w:spacing w:line="250" w:lineRule="auto"/>
             </w:pPr>
             <w:r>
@@ -2386,6 +2417,7 @@
           </w:tcPr>
           <w:p>
             <w:pPr>
+              <w:keepNext/>
               <w:spacing w:line="250" w:lineRule="auto"/>
             </w:pPr>
             <w:r>
@@ -2405,6 +2437,9 @@
             <w:bottom w:w="0" w:type="dxa"/>
           </w:tblCellMar>
         </w:tblPrEx>
+        <w:trPr>
+          <w:cantSplit/>
+        </w:trPr>
         <w:tc>
           <w:tcPr>
             <w:tcW w:w="1200" w:type="dxa"/>
@@ -2417,6 +2452,7 @@
           </w:tcPr>
           <w:p>
             <w:pPr>
+              <w:keepNext/>
               <w:spacing w:line="250" w:lineRule="auto"/>
             </w:pPr>
             <w:r>
@@ -2440,6 +2476,7 @@
           </w:tcPr>
           <w:p>
             <w:pPr>
+              <w:keepNext/>
               <w:spacing w:line="250" w:lineRule="auto"/>
             </w:pPr>
             <w:r>
@@ -2463,6 +2500,7 @@
           </w:tcPr>
           <w:p>
             <w:pPr>
+              <w:keepNext/>
               <w:spacing w:line="250" w:lineRule="auto"/>
             </w:pPr>
             <w:r>
@@ -2486,6 +2524,7 @@
           </w:tcPr>
           <w:p>
             <w:pPr>
+              <w:keepNext/>
               <w:spacing w:line="250" w:lineRule="auto"/>
             </w:pPr>
             <w:r>
@@ -2509,6 +2548,7 @@
           </w:tcPr>
           <w:p>
             <w:pPr>
+              <w:keepNext/>
               <w:spacing w:line="250" w:lineRule="auto"/>
             </w:pPr>
             <w:r>
@@ -2532,6 +2572,7 @@
           </w:tcPr>
           <w:p>
             <w:pPr>
+              <w:keepNext/>
               <w:spacing w:line="250" w:lineRule="auto"/>
             </w:pPr>
             <w:r>
@@ -2551,6 +2592,9 @@
             <w:bottom w:w="0" w:type="dxa"/>
           </w:tblCellMar>
         </w:tblPrEx>
+        <w:trPr>
+          <w:cantSplit/>
+        </w:trPr>
         <w:tc>
           <w:tcPr>
             <w:tcW w:w="1200" w:type="dxa"/>
@@ -2563,6 +2607,7 @@
           </w:tcPr>
           <w:p>
             <w:pPr>
+              <w:keepNext/>
               <w:spacing w:line="250" w:lineRule="auto"/>
             </w:pPr>
             <w:r>
@@ -2586,6 +2631,7 @@
           </w:tcPr>
           <w:p>
             <w:pPr>
+              <w:keepNext/>
               <w:spacing w:line="250" w:lineRule="auto"/>
             </w:pPr>
             <w:r>
@@ -2609,6 +2655,7 @@
           </w:tcPr>
           <w:p>
             <w:pPr>
+              <w:keepNext/>
               <w:spacing w:line="250" w:lineRule="auto"/>
             </w:pPr>
             <w:r>
@@ -2632,6 +2679,7 @@
           </w:tcPr>
           <w:p>
             <w:pPr>
+              <w:keepNext/>
               <w:spacing w:line="250" w:lineRule="auto"/>
             </w:pPr>
             <w:r>
@@ -2655,6 +2703,7 @@
           </w:tcPr>
           <w:p>
             <w:pPr>
+              <w:keepNext/>
               <w:spacing w:line="250" w:lineRule="auto"/>
             </w:pPr>
             <w:r>
@@ -2678,6 +2727,7 @@
           </w:tcPr>
           <w:p>
             <w:pPr>
+              <w:keepNext/>
               <w:spacing w:line="250" w:lineRule="auto"/>
             </w:pPr>
             <w:r>
@@ -2697,6 +2747,9 @@
             <w:bottom w:w="0" w:type="dxa"/>
           </w:tblCellMar>
         </w:tblPrEx>
+        <w:trPr>
+          <w:cantSplit/>
+        </w:trPr>
         <w:tc>
           <w:tcPr>
             <w:tcW w:w="1200" w:type="dxa"/>
@@ -2709,6 +2762,7 @@
           </w:tcPr>
           <w:p>
             <w:pPr>
+              <w:keepNext/>
               <w:spacing w:line="250" w:lineRule="auto"/>
             </w:pPr>
             <w:r>
@@ -2734,6 +2788,7 @@
           </w:tcPr>
           <w:p>
             <w:pPr>
+              <w:keepNext/>
               <w:spacing w:line="250" w:lineRule="auto"/>
             </w:pPr>
             <w:r>
@@ -2757,6 +2812,7 @@
           </w:tcPr>
           <w:p>
             <w:pPr>
+              <w:keepNext/>
               <w:spacing w:line="250" w:lineRule="auto"/>
             </w:pPr>
             <w:r>
@@ -2780,6 +2836,7 @@
           </w:tcPr>
           <w:p>
             <w:pPr>
+              <w:keepNext/>
               <w:spacing w:line="250" w:lineRule="auto"/>
             </w:pPr>
             <w:r>
@@ -2803,6 +2860,7 @@
           </w:tcPr>
           <w:p>
             <w:pPr>
+              <w:keepNext/>
               <w:spacing w:line="250" w:lineRule="auto"/>
             </w:pPr>
             <w:r>
@@ -2826,6 +2884,7 @@
           </w:tcPr>
           <w:p>
             <w:pPr>
+              <w:keepNext/>
               <w:spacing w:line="250" w:lineRule="auto"/>
             </w:pPr>
             <w:r>
@@ -2841,6 +2900,7 @@
     </w:tbl>
     <w:p>
       <w:pPr>
+        <w:keepLines/>
         <w:spacing w:after="200" w:line="300" w:lineRule="auto"/>
         <w:jc w:val="both"/>
       </w:pPr>
@@ -2977,10 +3037,23 @@
         <w:jc w:val="both"/>
       </w:pPr>
       <w:r>
-        <w:t>Everything so far compared a simulation against two specifications. EPH produced a hand path; minimum jerk and VITE were hand paths. The comparison so far has been unfair</w:t>
-      </w:r>
-      <w:r>
-        <w:t>. Comparing them fairly requires all three controllers to drive the same six muscles through the same limb dynamics.</w:t>
+        <w:t xml:space="preserve">Everything so far compared a simulation against two specifications. EPH produced a hand path; minimum jerk and VITE were hand paths. The comparison so far has been unfair. This section makes the two plans drive the same six muscles and the same arm as EPH.</w:t>
+      </w:r>
+    </w:p>
+    <w:p>
+      <w:pPr>
+        <w:spacing w:after="160" w:line="300" w:lineRule="auto"/>
+        <w:jc w:val="both"/>
+      </w:pPr>
+      <w:r>
+        <w:rPr>
+          <w:b/>
+          <w:bCs/>
+        </w:rPr>
+        <w:t xml:space="preserve">A plan executed without an internal model. </w:t>
+      </w:r>
+      <w:r>
+        <w:t xml:space="preserve">A plan has to be executed by some controller, and the choice matters. Here the plans are executed by Week 4’s threshold controller, which has no model of the arm’s mass or inertia. It sets muscle thresholds and leaves the rest to the muscles and the limb. Week 6 executes the same kind of plan with a controller that has an exact model of the arm’s dynamics, so the two weeks together show what such a model buys. The numbers in this section describe this model arm at the co-contraction used throughout (C = 0.25). They illustrate a mechanism; they are not measurements of human reaching.</w:t>
       </w:r>
     </w:p>
     <w:p>
@@ -3018,6 +3091,7 @@
     </w:p>
     <w:p>
       <w:pPr>
+        <w:keepNext/>
         <w:spacing w:before="200" w:after="80"/>
         <w:jc w:val="center"/>
       </w:pPr>
@@ -3030,7 +3104,7 @@
           <wp:inline distT="0" distB="0" distL="0" distR="0" wp14:anchorId="537D8236" wp14:editId="10F92192">
             <wp:extent cx="5333970" cy="3601437"/>
             <wp:effectExtent l="0" t="0" r="0" b="0"/>
-            <wp:docPr id="1757985193" name="Figure 6a" descr="The execution pipeline, one panel per arrow, for the 135° reach. ① VITE produces a planned hand path in Cartesian coordinates — perfectly straight. ② Inverse kinematics converts every point on it to the shoulder and elbow angles that would place the hand there; note that a straight hand path requires strongly non-linear joint trajectories. ③ The Week 4 solver converts each posture to the six muscle thresholds whose equilibrium is that posture — these are the only signals actually sent to the arm. ④ The plant integrates six muscles and the limb dynamics from those thresholds, and the hand goes where the physics takes it. Nothing after panel ① knows what the plan was; the divergence in ④ is entirely the plant’s doing. Panels are ordered left to right, top to bottom, with borders colored by stage." title="Figure 6a"/>
+            <wp:docPr id="1757985193" name="Figure 6a" descr="The execution pipeline, one panel per arrow, for the 135° reach. ① VITE produces a planned hand path in Cartesian coordinates — perfectly straight. ② Inverse kinematics converts every point on it to the shoulder and elbow angles that would place the hand there; note that a straight hand path requires strongly nonlinear joint trajectories. ③ The Week 4 solver converts each posture to the six muscle thresholds whose equilibrium is that posture — these are the only signals actually sent to the arm. ④ The plant integrates six muscles and the limb dynamics from those thresholds, and the hand goes where the physics takes it. Nothing after panel ① knows what the plan was; the divergence in ④ is entirely the plant’s doing. Panels are ordered left to right, top to bottom, with borders colored by stage." title="Figure 6a"/>
             <wp:cNvGraphicFramePr>
               <a:graphicFrameLocks xmlns:a="http://schemas.openxmlformats.org/drawingml/2006/main" noChangeAspect="1"/>
             </wp:cNvGraphicFramePr>
@@ -3068,6 +3142,7 @@
     </w:p>
     <w:p>
       <w:pPr>
+        <w:keepLines/>
         <w:spacing w:after="200" w:line="260" w:lineRule="auto"/>
         <w:jc w:val="both"/>
       </w:pPr>
@@ -3089,7 +3164,7 @@
           <w:sz w:val="18"/>
           <w:szCs w:val="18"/>
         </w:rPr>
-        <w:t xml:space="preserve">The execution pipeline, one panel per arrow, for the 135° reach. ① VITE produces a planned hand path in Cartesian coordinates — perfectly straight. ② Inverse kinematics converts every point on it to the shoulder and elbow angles that would place the hand there; note that a straight hand path requires strongly non-linear joint trajectories. ③ The Week 4 solver converts each posture to the six muscle thresholds whose equilibrium is that posture — these are the only signals actually sent to the arm. ④ The plant integrates six muscles and the limb dynamics from those thresholds, and the hand goes where the physics takes it. Nothing after panel ① knows what the plan was; the divergence in ④ is entirely the plant’s doing. Panels are ordered left to right, top to bottom, with borders colored by stage.</w:t>
+        <w:t xml:space="preserve">The execution pipeline, one panel per arrow, for the 135° reach. ① VITE produces a planned hand path in Cartesian coordinates — perfectly straight. ② Inverse kinematics converts every point on it to the shoulder and elbow angles that would place the hand there; note that a straight hand path requires strongly nonlinear joint trajectories. ③ The Week 4 solver converts each posture to the six muscle thresholds whose equilibrium is that posture — these are the only signals actually sent to the arm. ④ The plant integrates six muscles and the limb dynamics from those thresholds, and the hand goes where the physics takes it. Nothing after panel ① knows what the plan was; the divergence in ④ is entirely the plant’s doing. Panels are ordered left to right, top to bottom, with borders colored by stage.</w:t>
       </w:r>
     </w:p>
     <w:p>
@@ -3103,6 +3178,7 @@
     </w:p>
     <w:p>
       <w:pPr>
+        <w:keepNext/>
         <w:spacing w:before="200" w:after="80"/>
         <w:jc w:val="center"/>
       </w:pPr>
@@ -3152,6 +3228,7 @@
     </w:p>
     <w:p>
       <w:pPr>
+        <w:keepLines/>
         <w:spacing w:after="200" w:line="260" w:lineRule="auto"/>
         <w:jc w:val="both"/>
       </w:pPr>
@@ -3184,14 +3261,7 @@
         <w:jc w:val="both"/>
       </w:pPr>
       <w:r>
-        <w:rPr>
-          <w:b/>
-          <w:bCs/>
-        </w:rPr>
-        <w:t xml:space="preserve">Note panel B of Figure 6b. </w:t>
-      </w:r>
-      <w:r>
-        <w:t xml:space="preserve">The executed speed profile is not a bell — it is double-peaked. That is a genuine feature of the plant's response, not a numerical artifact: refining the threshold waypoints from 25 ms to 2 ms changes the curvature by 0.02 cm and leaves both peaks in place. So execution costs both invariants at this target, not just straightness.</w:t>
+        <w:t xml:space="preserve">Panel B of Figure 6b shows a second casualty: the executed speed profile is not a bell but has two peaks. Refining the threshold waypoints from 25 ms to 2 ms leaves both peaks in place, so this is the plant’s behavior, not a numerical artifact.</w:t>
       </w:r>
     </w:p>
     <w:p>
@@ -3250,6 +3320,7 @@
     </w:p>
     <w:p>
       <w:pPr>
+        <w:keepNext/>
         <w:spacing w:before="200" w:after="80"/>
         <w:jc w:val="center"/>
       </w:pPr>
@@ -3299,6 +3370,7 @@
     </w:p>
     <w:p>
       <w:pPr>
+        <w:keepLines/>
         <w:spacing w:after="200" w:line="260" w:lineRule="auto"/>
         <w:jc w:val="both"/>
       </w:pPr>
@@ -3353,6 +3425,7 @@
     </w:p>
     <w:p>
       <w:pPr>
+        <w:keepNext/>
         <w:spacing w:before="200" w:after="80"/>
         <w:jc w:val="center"/>
       </w:pPr>
@@ -3403,6 +3476,7 @@
     </w:p>
     <w:p>
       <w:pPr>
+        <w:keepLines/>
         <w:spacing w:after="200" w:line="260" w:lineRule="auto"/>
         <w:jc w:val="both"/>
       </w:pPr>
@@ -3479,63 +3553,32 @@
         <w:jc w:val="both"/>
       </w:pPr>
       <w:r>
-        <w:t xml:space="preserve">The two task-space planners are worth comparing directly, because they are different circuits producing the same straight line. Minimum jerk executes to 0.88 cm and VITE to </w:t>
-      </w:r>
-      <w:r>
-        <w:rPr>
-          <w:b/>
-          <w:bCs/>
-        </w:rPr>
-        <w:t>1.01 cm</w:t>
-      </w:r>
-      <w:r>
-        <w:t xml:space="preserve">, and even that small gap is not a difference between the planners — it is plan speed. Slow VITE’s plan or shorten minimum jerk’s to match, and they converge: at a common 372 ms plan duration minimum jerk executes to </w:t>
-      </w:r>
-      <w:r>
-        <w:rPr>
-          <w:b/>
-          <w:bCs/>
-        </w:rPr>
-        <w:t>1.03 cm</w:t>
-      </w:r>
-      <w:r>
-        <w:t xml:space="preserve"> against VITE’s </w:t>
-      </w:r>
-      <w:r>
-        <w:rPr>
-          <w:b/>
-          <w:bCs/>
-        </w:rPr>
-        <w:t>1.01 cm</w:t>
-      </w:r>
-      <w:r>
-        <w:t>, direction by direction, to within 0.08 cm.</w:t>
-      </w:r>
-    </w:p>
-    <w:p>
-      <w:pPr>
-        <w:spacing w:after="160" w:line="300" w:lineRule="auto"/>
-        <w:jc w:val="both"/>
-      </w:pPr>
-      <w:r>
-        <w:rPr>
-          <w:b/>
-          <w:bCs/>
-        </w:rPr>
-        <w:t xml:space="preserve">This inverts the argument of §3. </w:t>
-      </w:r>
-      <w:r>
-        <w:t xml:space="preserve">The story there was that EPH curves because it plans in muscle coordinates, while task-space planners are straight. But once a task-space plan has to be realized by muscles, it curves too — by the same amount, with the same directional signature. </w:t>
-      </w:r>
-      <w:r>
-        <w:rPr>
-          <w:b/>
-          <w:bCs/>
-        </w:rPr>
-        <w:t>The curvature was never a property of the planner. It is a property of the plant.</w:t>
-      </w:r>
-      <w:r>
-        <w:t xml:space="preserve"> A limb with inertia lags its commanded equilibrium, that lag lives in joint coordinates, and a straight line in hand space does not survive the trip.</w:t>
+        <w:t xml:space="preserve">The small gap between the two task-space planners is plan speed, not a difference between them. At a common 372 ms plan duration, minimum jerk executes to 1.03 cm against VITE’s 1.01 cm, direction by direction, to within 0.08 cm.</w:t>
+      </w:r>
+    </w:p>
+    <w:p>
+      <w:pPr>
+        <w:spacing w:after="160" w:line="300" w:lineRule="auto"/>
+        <w:jc w:val="both"/>
+      </w:pPr>
+      <w:r>
+        <w:rPr>
+          <w:b/>
+          <w:bCs/>
+        </w:rPr>
+        <w:t xml:space="preserve">EPH curves for the same reason. </w:t>
+      </w:r>
+      <w:r>
+        <w:t xml:space="preserve">In §3 it was natural to read EPH’s curvature as a product of planning in muscle coordinates. But EPH’s command is also nearly straight. If the arm could follow its moving equilibrium without any lag, EPH’s threshold ramp would trace a path within 0.27 cm of straight in every direction, 0.14 cm on average. Slowed from 350 ms to 2 s, the executed EPH reach curves only 0.19 cm on average. So the 0.84 cm of Figure 3 is almost all lag, like the curvature of the two executed plans.</w:t>
+      </w:r>
+    </w:p>
+    <w:p>
+      <w:pPr>
+        <w:spacing w:after="160" w:line="300" w:lineRule="auto"/>
+        <w:jc w:val="both"/>
+      </w:pPr>
+      <w:r>
+        <w:t xml:space="preserve">The curvature was never a property of the planner. It is a property of the plant. A limb with inertia lags its commanded equilibrium, that lag lives in joint coordinates, and a straight line in hand space does not survive the trip.</w:t>
       </w:r>
     </w:p>
     <w:p>
@@ -3549,6 +3592,7 @@
     </w:p>
     <w:p>
       <w:pPr>
+        <w:keepNext/>
         <w:spacing w:before="200" w:after="80"/>
         <w:jc w:val="center"/>
       </w:pPr>
@@ -3599,6 +3643,7 @@
     </w:p>
     <w:p>
       <w:pPr>
+        <w:keepLines/>
         <w:spacing w:after="200" w:line="260" w:lineRule="auto"/>
         <w:jc w:val="both"/>
       </w:pPr>
@@ -3740,7 +3785,7 @@
         <w:jc w:val="both"/>
       </w:pPr>
       <w:r>
-        <w:t xml:space="preserve">Slowing down straightens the path, but a 1339 ms reach is far slower than natural reaching. The diagnosis behind Figure 6c suggests two other fixes, and both can be tested on this plant. Figure 6f tests them on the 135° reach, where the uncorrected path curves 2.96 cm.</w:t>
+        <w:t xml:space="preserve">Slowing down works, but natural reaches are much faster than 1339 ms. Two other fixes can be tested on this plant, both on the 135° reach, where the executed path curves 2.96 cm.</w:t>
       </w:r>
     </w:p>
     <w:p>
@@ -3756,16 +3801,7 @@
         <w:t xml:space="preserve">Stiffen the arm. </w:t>
       </w:r>
       <w:r>
-        <w:t xml:space="preserve">Week 4’s C-command sets co-contraction: how strongly opposing muscles pull against each other at the same time. Higher co-contraction makes every muscle spring stiffer. A stiffer spring pulls each joint toward its commanded posture sooner, so both lags shrink, and so does the difference between them. Raising C from 0.25 to 0.40 reduces the curvature from 2.96 to 1.55 cm (Figure 6f, panel A, blue). Lowering C to 0.10 raises it to 5.17 cm.</w:t>
-      </w:r>
-    </w:p>
-    <w:p>
-      <w:pPr>
-        <w:spacing w:after="160" w:line="300" w:lineRule="auto"/>
-        <w:jc w:val="both"/>
-      </w:pPr>
-      <w:r>
-        <w:t xml:space="preserve">The price is muscle force that produces no movement. Holding the starting posture, the six muscles pull with a combined 121 N at C = 0.25 and 307 N at C = 0.40, and their torques cancel. People do co-contract more when a task demands accuracy (Gribble et al. 2003). Here, though, two and a half times the force only halves the curvature.</w:t>
+        <w:t xml:space="preserve">Raising co-contraction from C = 0.25 to 0.40 makes every muscle spring stiffer, so both joints lag less and the curvature falls to 1.55 cm. The price is muscle force that produces no movement: holding the starting posture takes 307 N of combined muscle force instead of 121 N. People do co-contract more when a task demands accuracy (Gribble et al. 2003). Here, though, two and a half times the force only halves the curvature.</w:t>
       </w:r>
     </w:p>
     <w:p>
@@ -3781,219 +3817,16 @@
         <w:t xml:space="preserve">Correct the timing of the command. </w:t>
       </w:r>
       <w:r>
-        <w:t xml:space="preserve">Figure 6c showed that the arm’s elbow runs about 47 ms ahead of its shoulder, relative to the plan: 143 ms of lag against 190 ms. A controller that knew this could send the elbow its command 47 ms late. The shoulder command stays as planned, and so does the co-contraction. With that one change the curvature falls from 2.96 to 0.61 cm (Figure 6f, panel A, orange).</w:t>
-      </w:r>
-    </w:p>
-    <w:p>
-      <w:pPr>
-        <w:spacing w:after="160" w:line="300" w:lineRule="auto"/>
-        <w:jc w:val="both"/>
-      </w:pPr>
-      <w:r>
-        <w:t xml:space="preserve">The delay has to be right. Panel B of Figure 6f sweeps it from 0 to 100 ms. With too little delay the elbow still arrives early, and the path still bows up and to the right. With too much, the elbow arrives late and the path bows down and to the left instead; at 100 ms the curvature is back up to 2.56 cm. The best delay, near 50 ms, still leaves about 0.5 cm. A single time shift cannot fully match a lag that changes as the posture changes.</w:t>
-      </w:r>
-    </w:p>
-    <w:p>
-      <w:pPr>
-        <w:spacing w:before="200" w:after="80"/>
-        <w:jc w:val="center"/>
-      </w:pPr>
-      <w:r>
-        <w:rPr>
-          <w:noProof/>
-        </w:rPr>
-        <w:drawing>
-          <wp:inline distT="0" distB="0" distL="0" distR="0" wp14:anchorId="547DF9A1" wp14:editId="547DF9A1">
-            <wp:extent cx="6115050" cy="2620736"/>
-            <wp:effectExtent l="0" t="0" r="0" b="0"/>
-            <wp:docPr id="1719154700" name="Figure 6f" descr="Two ways to straighten the executed path, tested on the 135° reach. (A) The plan executed with no correction (purple, 2.96 cm), with co-contraction raised from C = 0.25 to 0.40 (blue, 1.55 cm), and with the elbow’s thresholds sent 47 ms late (orange, 0.61 cm). The dotted curve is the equilibrium path commanded for the orange run; it bows 3.19 cm to the other side of the plan. (B) Curvature against the delay added to the elbow command. Purple points bow up and to the right, like the uncorrected path; orange points bow down and to the left. The ringed point is the measured 47 ms lag difference." title="Figure 6f"/>
-            <wp:cNvGraphicFramePr>
-              <a:graphicFrameLocks xmlns:a="http://schemas.openxmlformats.org/drawingml/2006/main" noChangeAspect="1"/>
-            </wp:cNvGraphicFramePr>
-            <a:graphic xmlns:a="http://schemas.openxmlformats.org/drawingml/2006/main">
-              <a:graphicData uri="http://schemas.openxmlformats.org/drawingml/2006/picture">
-                <pic:pic xmlns:pic="http://schemas.openxmlformats.org/drawingml/2006/picture">
-                  <pic:nvPicPr>
-                    <pic:cNvPr id="0" name=""/>
-                    <pic:cNvPicPr>
-                      <a:picLocks noChangeAspect="1" noChangeArrowheads="1"/>
-                    </pic:cNvPicPr>
-                  </pic:nvPicPr>
-                  <pic:blipFill>
-                    <a:blip r:embed="rId25"/>
-                    <a:srcRect/>
-                    <a:stretch>
-                      <a:fillRect/>
-                    </a:stretch>
-                  </pic:blipFill>
-                  <pic:spPr bwMode="auto">
-                    <a:xfrm>
-                      <a:off x="0" y="0"/>
-                      <a:ext cx="6115050" cy="2620736"/>
-                    </a:xfrm>
-                    <a:prstGeom prst="rect">
-                      <a:avLst/>
-                    </a:prstGeom>
-                  </pic:spPr>
-                </pic:pic>
-              </a:graphicData>
-            </a:graphic>
-          </wp:inline>
-        </w:drawing>
-      </w:r>
-    </w:p>
-    <w:p>
-      <w:pPr>
-        <w:spacing w:after="200" w:line="260" w:lineRule="auto"/>
-        <w:jc w:val="both"/>
-      </w:pPr>
-      <w:r>
-        <w:rPr>
-          <w:b/>
-          <w:bCs/>
-          <w:color w:val="555555"/>
-          <w:sz w:val="18"/>
-          <w:szCs w:val="18"/>
-        </w:rPr>
-        <w:t xml:space="preserve">Figure 6f. </w:t>
-      </w:r>
-      <w:r>
-        <w:rPr>
-          <w:i/>
-          <w:iCs/>
-          <w:color w:val="555555"/>
-          <w:sz w:val="18"/>
-          <w:szCs w:val="18"/>
-        </w:rPr>
-        <w:t xml:space="preserve">Two ways to straighten the executed path, tested on the 135° reach. (A) The plan executed with no correction (purple, 2.96 cm), with co-contraction raised from C = 0.25 to 0.40 (blue, 1.55 cm), and with the elbow’s thresholds sent 47 ms late (orange, 0.61 cm). The dotted curve is the equilibrium path commanded for the orange run; it bows 3.19 cm to the other side of the plan. (B) Curvature against the delay added to the elbow command. Purple points bow up and to the right, like the uncorrected path; orange points bow down and to the left. The ringed point is the measured 47 ms lag difference.</w:t>
-      </w:r>
-    </w:p>
-    <w:p>
-      <w:pPr>
-        <w:spacing w:after="160" w:line="300" w:lineRule="auto"/>
-        <w:jc w:val="both"/>
-      </w:pPr>
-      <w:r>
-        <w:t xml:space="preserve">The right delay also depends on direction. The lag difference comes from the inertia each joint must move, and that changes with the direction of the reach. Measured as in Figure 6c, it ranges from 92 ms at 0° to −29 ms at 45°, where it is the shoulder that must be held back. Figure 6g compares three policies across the eight targets. One 47 ms delay for every direction lowers the mean curvature from 1.01 to 0.59 cm. It also makes two directions worse: 45° goes from 0.26 to 0.52 cm, and 270° from 0.44 to 1.41 cm. Giving each direction its own measured delay lowers the mean to 0.42 cm. The measured delay is only an estimate, though. At 90° the fixed 47 ms does better than that direction’s own 33 ms (0.70 against 1.09 cm).</w:t>
-      </w:r>
-    </w:p>
-    <w:p>
-      <w:pPr>
-        <w:spacing w:before="200" w:after="80"/>
-        <w:jc w:val="center"/>
-      </w:pPr>
-      <w:r>
-        <w:rPr>
-          <w:noProof/>
-        </w:rPr>
-        <w:drawing>
-          <wp:inline distT="0" distB="0" distL="0" distR="0" wp14:anchorId="547DF9A2" wp14:editId="547DF9A2">
-            <wp:extent cx="5120640" cy="2179661"/>
-            <wp:effectExtent l="0" t="0" r="0" b="0"/>
-            <wp:docPr id="1719154701" name="Figure 6g" descr="Executed curvature at all eight targets under three timing policies: no correction, one 47 ms elbow delay for every direction, and each direction’s own measured delay. A negative delay, as at 45°, holds back the shoulder instead. The single fixed delay lowers the mean but makes 45° and 270° worse." title="Figure 6g"/>
-            <wp:cNvGraphicFramePr>
-              <a:graphicFrameLocks xmlns:a="http://schemas.openxmlformats.org/drawingml/2006/main" noChangeAspect="1"/>
-            </wp:cNvGraphicFramePr>
-            <a:graphic xmlns:a="http://schemas.openxmlformats.org/drawingml/2006/main">
-              <a:graphicData uri="http://schemas.openxmlformats.org/drawingml/2006/picture">
-                <pic:pic xmlns:pic="http://schemas.openxmlformats.org/drawingml/2006/picture">
-                  <pic:nvPicPr>
-                    <pic:cNvPr id="0" name=""/>
-                    <pic:cNvPicPr>
-                      <a:picLocks noChangeAspect="1" noChangeArrowheads="1"/>
-                    </pic:cNvPicPr>
-                  </pic:nvPicPr>
-                  <pic:blipFill>
-                    <a:blip r:embed="rId26"/>
-                    <a:srcRect/>
-                    <a:stretch>
-                      <a:fillRect/>
-                    </a:stretch>
-                  </pic:blipFill>
-                  <pic:spPr bwMode="auto">
-                    <a:xfrm>
-                      <a:off x="0" y="0"/>
-                      <a:ext cx="5120640" cy="2179661"/>
-                    </a:xfrm>
-                    <a:prstGeom prst="rect">
-                      <a:avLst/>
-                    </a:prstGeom>
-                  </pic:spPr>
-                </pic:pic>
-              </a:graphicData>
-            </a:graphic>
-          </wp:inline>
-        </w:drawing>
-      </w:r>
-    </w:p>
-    <w:p>
-      <w:pPr>
-        <w:spacing w:after="200" w:line="260" w:lineRule="auto"/>
-        <w:jc w:val="both"/>
-      </w:pPr>
-      <w:r>
-        <w:rPr>
-          <w:b/>
-          <w:bCs/>
-          <w:color w:val="555555"/>
-          <w:sz w:val="18"/>
-          <w:szCs w:val="18"/>
-        </w:rPr>
-        <w:t xml:space="preserve">Figure 6g. </w:t>
-      </w:r>
-      <w:r>
-        <w:rPr>
-          <w:i/>
-          <w:iCs/>
-          <w:color w:val="555555"/>
-          <w:sz w:val="18"/>
-          <w:szCs w:val="18"/>
-        </w:rPr>
-        <w:t xml:space="preserve">Executed curvature at all eight targets under three timing policies: no correction, one 47 ms elbow delay for every direction, and each direction’s own measured delay. A negative delay, as at 45°, holds back the shoulder instead. The single fixed delay lowers the mean but makes 45° and 270° worse.</w:t>
-      </w:r>
-    </w:p>
-    <w:p>
-      <w:pPr>
-        <w:spacing w:after="160" w:line="300" w:lineRule="auto"/>
-        <w:jc w:val="both"/>
-      </w:pPr>
-      <w:r>
-        <w:rPr>
-          <w:b/>
-          <w:bCs/>
-        </w:rPr>
-        <w:t xml:space="preserve">What the correction requires. </w:t>
-      </w:r>
-      <w:r>
-        <w:t xml:space="preserve">To choose the delay, the controller must know in advance which joint will fall behind, and by how much, for this posture and this direction. That information is in the arm’s inertia. A controller that has it carries a model of the arm’s dynamics, called an </w:t>
-      </w:r>
-      <w:r>
-        <w:rPr>
-          <w:i/>
-          <w:iCs/>
-        </w:rPr>
-        <w:t xml:space="preserve">internal model</w:t>
-      </w:r>
-      <w:r>
-        <w:t xml:space="preserve">. A timing shift is a crude use of such a model. The full use is inverse dynamics: from the plan and the model, compute the joint torques that make the arm follow the plan. Week 6 builds that controller.</w:t>
-      </w:r>
-    </w:p>
-    <w:p>
-      <w:pPr>
-        <w:spacing w:after="160" w:line="300" w:lineRule="auto"/>
-        <w:jc w:val="both"/>
-      </w:pPr>
-      <w:r>
-        <w:t xml:space="preserve">The corrected command is also no longer straight. Its equilibrium path, the hand position that each instant’s command would settle at, bows 3.19 cm to the other side of the plan (Figure 6f, panel A, dotted). The command has to curve one way so that the arm’s unequal lags can bend it back. This matters for the equilibrium-point hypothesis, whose appeal was that simple commands are enough. Gomi and Kawato (1996) reached a similar conclusion by measuring arm stiffness during movement. The stiffness they found was low. With stiffness that low, the equilibrium trajectory needed to reproduce real reaches would have to be complex. Week 12 examines that claim.</w:t>
-      </w:r>
-    </w:p>
-    <w:p>
-      <w:pPr>
-        <w:spacing w:after="160" w:line="300" w:lineRule="auto"/>
-        <w:jc w:val="both"/>
-      </w:pPr>
-      <w:r>
-        <w:t xml:space="preserve">Two other routes do not require the correction to be worked out before the reach begins. Feedback control senses the deviation during the reach and corrects it (Week 13). Adaptation adjusts the command from one reach to the next until the error shrinks (Week 15).</w:t>
+        <w:t xml:space="preserve">The elbow runs about 47 ms ahead of the shoulder (Figure 6c), so sending the elbow its command 47 ms late cuts the curvature to 0.61 cm. But the right delay changes with direction, from 92 ms at 0° to −29 ms at 45°, where the shoulder must be held back instead. It changes because the inertia each joint must move changes with direction. A single fixed delay lowers the mean curvature from 1.01 to 0.59 cm but makes some directions worse. Choosing the delay well means knowing the arm’s inertia in advance, which means carrying a model of the arm’s dynamics: an internal model. Week 6 gives the controller a complete one.</w:t>
+      </w:r>
+    </w:p>
+    <w:p>
+      <w:pPr>
+        <w:spacing w:after="160" w:line="300" w:lineRule="auto"/>
+        <w:jc w:val="both"/>
+      </w:pPr>
+      <w:r>
+        <w:t xml:space="preserve">The corrected command is itself curved. Its equilibrium path bows about 3 cm to the other side of the plan, so that the arm’s unequal lags can bend it back. Gomi and Kawato (1996) argued from arm stiffness measured during movement that real equilibrium trajectories would need to be complex in this way; Week 12 returns to that claim. Feedback control (Week 13) and adaptation (Week 15) offer ways to straighten a path without working out the correction in advance.</w:t>
       </w:r>
     </w:p>
     <w:p>
@@ -4046,6 +3879,9 @@
             <w:bottom w:w="0" w:type="dxa"/>
           </w:tblCellMar>
         </w:tblPrEx>
+        <w:trPr>
+          <w:cantSplit/>
+        </w:trPr>
         <w:tc>
           <w:tcPr>
             <w:tcW w:w="2300" w:type="dxa"/>
@@ -4059,6 +3895,7 @@
           </w:tcPr>
           <w:p>
             <w:pPr>
+              <w:keepNext/>
               <w:spacing w:line="250" w:lineRule="auto"/>
             </w:pPr>
             <w:r>
@@ -4085,6 +3922,7 @@
           </w:tcPr>
           <w:p>
             <w:pPr>
+              <w:keepNext/>
               <w:spacing w:line="250" w:lineRule="auto"/>
             </w:pPr>
             <w:r>
@@ -4111,6 +3949,7 @@
           </w:tcPr>
           <w:p>
             <w:pPr>
+              <w:keepNext/>
               <w:spacing w:line="250" w:lineRule="auto"/>
             </w:pPr>
             <w:r>
@@ -4137,6 +3976,7 @@
           </w:tcPr>
           <w:p>
             <w:pPr>
+              <w:keepNext/>
               <w:spacing w:line="250" w:lineRule="auto"/>
             </w:pPr>
             <w:r>
@@ -4158,6 +3998,9 @@
             <w:bottom w:w="0" w:type="dxa"/>
           </w:tblCellMar>
         </w:tblPrEx>
+        <w:trPr>
+          <w:cantSplit/>
+        </w:trPr>
         <w:tc>
           <w:tcPr>
             <w:tcW w:w="2300" w:type="dxa"/>
@@ -4170,6 +4013,7 @@
           </w:tcPr>
           <w:p>
             <w:pPr>
+              <w:keepNext/>
               <w:spacing w:line="250" w:lineRule="auto"/>
             </w:pPr>
             <w:r>
@@ -4195,6 +4039,7 @@
           </w:tcPr>
           <w:p>
             <w:pPr>
+              <w:keepNext/>
               <w:spacing w:line="250" w:lineRule="auto"/>
             </w:pPr>
             <w:r>
@@ -4218,6 +4063,7 @@
           </w:tcPr>
           <w:p>
             <w:pPr>
+              <w:keepNext/>
               <w:spacing w:line="250" w:lineRule="auto"/>
             </w:pPr>
             <w:r>
@@ -4241,6 +4087,7 @@
           </w:tcPr>
           <w:p>
             <w:pPr>
+              <w:keepNext/>
               <w:spacing w:line="250" w:lineRule="auto"/>
             </w:pPr>
             <w:r>
@@ -4260,6 +4107,9 @@
             <w:bottom w:w="0" w:type="dxa"/>
           </w:tblCellMar>
         </w:tblPrEx>
+        <w:trPr>
+          <w:cantSplit/>
+        </w:trPr>
         <w:tc>
           <w:tcPr>
             <w:tcW w:w="2300" w:type="dxa"/>
@@ -4272,6 +4122,7 @@
           </w:tcPr>
           <w:p>
             <w:pPr>
+              <w:keepNext/>
               <w:spacing w:line="250" w:lineRule="auto"/>
             </w:pPr>
             <w:r>
@@ -4297,6 +4148,7 @@
           </w:tcPr>
           <w:p>
             <w:pPr>
+              <w:keepNext/>
               <w:spacing w:line="250" w:lineRule="auto"/>
             </w:pPr>
             <w:r>
@@ -4320,6 +4172,7 @@
           </w:tcPr>
           <w:p>
             <w:pPr>
+              <w:keepNext/>
               <w:spacing w:line="250" w:lineRule="auto"/>
             </w:pPr>
             <w:r>
@@ -4343,6 +4196,7 @@
           </w:tcPr>
           <w:p>
             <w:pPr>
+              <w:keepNext/>
               <w:spacing w:line="250" w:lineRule="auto"/>
             </w:pPr>
             <w:r>
@@ -4362,6 +4216,9 @@
             <w:bottom w:w="0" w:type="dxa"/>
           </w:tblCellMar>
         </w:tblPrEx>
+        <w:trPr>
+          <w:cantSplit/>
+        </w:trPr>
         <w:tc>
           <w:tcPr>
             <w:tcW w:w="2300" w:type="dxa"/>
@@ -4374,6 +4231,7 @@
           </w:tcPr>
           <w:p>
             <w:pPr>
+              <w:keepNext/>
               <w:spacing w:line="250" w:lineRule="auto"/>
             </w:pPr>
             <w:r>
@@ -4399,6 +4257,7 @@
           </w:tcPr>
           <w:p>
             <w:pPr>
+              <w:keepNext/>
               <w:spacing w:line="250" w:lineRule="auto"/>
             </w:pPr>
             <w:r>
@@ -4422,6 +4281,7 @@
           </w:tcPr>
           <w:p>
             <w:pPr>
+              <w:keepNext/>
               <w:spacing w:line="250" w:lineRule="auto"/>
             </w:pPr>
             <w:r>
@@ -4445,6 +4305,7 @@
           </w:tcPr>
           <w:p>
             <w:pPr>
+              <w:keepNext/>
               <w:spacing w:line="250" w:lineRule="auto"/>
             </w:pPr>
             <w:r>
@@ -4464,6 +4325,9 @@
             <w:bottom w:w="0" w:type="dxa"/>
           </w:tblCellMar>
         </w:tblPrEx>
+        <w:trPr>
+          <w:cantSplit/>
+        </w:trPr>
         <w:tc>
           <w:tcPr>
             <w:tcW w:w="2300" w:type="dxa"/>
@@ -4476,6 +4340,7 @@
           </w:tcPr>
           <w:p>
             <w:pPr>
+              <w:keepNext/>
               <w:spacing w:line="250" w:lineRule="auto"/>
             </w:pPr>
             <w:r>
@@ -4501,6 +4366,7 @@
           </w:tcPr>
           <w:p>
             <w:pPr>
+              <w:keepNext/>
               <w:spacing w:line="250" w:lineRule="auto"/>
             </w:pPr>
             <w:r>
@@ -4524,6 +4390,7 @@
           </w:tcPr>
           <w:p>
             <w:pPr>
+              <w:keepNext/>
               <w:spacing w:line="250" w:lineRule="auto"/>
             </w:pPr>
             <w:r>
@@ -4547,6 +4414,7 @@
           </w:tcPr>
           <w:p>
             <w:pPr>
+              <w:keepNext/>
               <w:spacing w:line="250" w:lineRule="auto"/>
             </w:pPr>
             <w:r>
@@ -4566,6 +4434,9 @@
             <w:bottom w:w="0" w:type="dxa"/>
           </w:tblCellMar>
         </w:tblPrEx>
+        <w:trPr>
+          <w:cantSplit/>
+        </w:trPr>
         <w:tc>
           <w:tcPr>
             <w:tcW w:w="2300" w:type="dxa"/>
@@ -4578,6 +4449,7 @@
           </w:tcPr>
           <w:p>
             <w:pPr>
+              <w:keepNext/>
               <w:spacing w:line="250" w:lineRule="auto"/>
             </w:pPr>
             <w:r>
@@ -4603,6 +4475,7 @@
           </w:tcPr>
           <w:p>
             <w:pPr>
+              <w:keepNext/>
               <w:spacing w:line="250" w:lineRule="auto"/>
             </w:pPr>
             <w:r>
@@ -4626,6 +4499,7 @@
           </w:tcPr>
           <w:p>
             <w:pPr>
+              <w:keepNext/>
               <w:spacing w:line="250" w:lineRule="auto"/>
             </w:pPr>
             <w:r>
@@ -4649,6 +4523,7 @@
           </w:tcPr>
           <w:p>
             <w:pPr>
+              <w:keepNext/>
               <w:spacing w:line="250" w:lineRule="auto"/>
             </w:pPr>
             <w:r>
@@ -4668,6 +4543,9 @@
             <w:bottom w:w="0" w:type="dxa"/>
           </w:tblCellMar>
         </w:tblPrEx>
+        <w:trPr>
+          <w:cantSplit/>
+        </w:trPr>
         <w:tc>
           <w:tcPr>
             <w:tcW w:w="2300" w:type="dxa"/>
@@ -4680,6 +4558,7 @@
           </w:tcPr>
           <w:p>
             <w:pPr>
+              <w:keepNext/>
               <w:spacing w:line="250" w:lineRule="auto"/>
             </w:pPr>
             <w:r>
@@ -4705,6 +4584,7 @@
           </w:tcPr>
           <w:p>
             <w:pPr>
+              <w:keepNext/>
               <w:spacing w:line="250" w:lineRule="auto"/>
             </w:pPr>
             <w:r>
@@ -4728,6 +4608,7 @@
           </w:tcPr>
           <w:p>
             <w:pPr>
+              <w:keepNext/>
               <w:spacing w:line="250" w:lineRule="auto"/>
             </w:pPr>
             <w:r>
@@ -4751,6 +4632,7 @@
           </w:tcPr>
           <w:p>
             <w:pPr>
+              <w:keepNext/>
               <w:spacing w:line="250" w:lineRule="auto"/>
             </w:pPr>
             <w:r>
@@ -4770,6 +4652,9 @@
             <w:bottom w:w="0" w:type="dxa"/>
           </w:tblCellMar>
         </w:tblPrEx>
+        <w:trPr>
+          <w:cantSplit/>
+        </w:trPr>
         <w:tc>
           <w:tcPr>
             <w:tcW w:w="2300" w:type="dxa"/>
@@ -4782,6 +4667,7 @@
           </w:tcPr>
           <w:p>
             <w:pPr>
+              <w:keepNext/>
               <w:spacing w:line="250" w:lineRule="auto"/>
             </w:pPr>
             <w:r>
@@ -4807,6 +4693,7 @@
           </w:tcPr>
           <w:p>
             <w:pPr>
+              <w:keepNext/>
               <w:spacing w:line="250" w:lineRule="auto"/>
             </w:pPr>
             <w:r>
@@ -4830,6 +4717,7 @@
           </w:tcPr>
           <w:p>
             <w:pPr>
+              <w:keepNext/>
               <w:spacing w:line="250" w:lineRule="auto"/>
             </w:pPr>
             <w:r>
@@ -4853,6 +4741,7 @@
           </w:tcPr>
           <w:p>
             <w:pPr>
+              <w:keepNext/>
               <w:spacing w:line="250" w:lineRule="auto"/>
             </w:pPr>
             <w:r>
@@ -4872,6 +4761,9 @@
             <w:bottom w:w="0" w:type="dxa"/>
           </w:tblCellMar>
         </w:tblPrEx>
+        <w:trPr>
+          <w:cantSplit/>
+        </w:trPr>
         <w:tc>
           <w:tcPr>
             <w:tcW w:w="2300" w:type="dxa"/>
@@ -4884,6 +4776,7 @@
           </w:tcPr>
           <w:p>
             <w:pPr>
+              <w:keepNext/>
               <w:spacing w:line="250" w:lineRule="auto"/>
             </w:pPr>
             <w:r>
@@ -4909,6 +4802,7 @@
           </w:tcPr>
           <w:p>
             <w:pPr>
+              <w:keepNext/>
               <w:spacing w:line="250" w:lineRule="auto"/>
             </w:pPr>
             <w:r>
@@ -4932,6 +4826,7 @@
           </w:tcPr>
           <w:p>
             <w:pPr>
+              <w:keepNext/>
               <w:spacing w:line="250" w:lineRule="auto"/>
             </w:pPr>
             <w:r>
@@ -4955,6 +4850,7 @@
           </w:tcPr>
           <w:p>
             <w:pPr>
+              <w:keepNext/>
               <w:spacing w:line="250" w:lineRule="auto"/>
             </w:pPr>
             <w:r>
@@ -4974,6 +4870,9 @@
             <w:bottom w:w="0" w:type="dxa"/>
           </w:tblCellMar>
         </w:tblPrEx>
+        <w:trPr>
+          <w:cantSplit/>
+        </w:trPr>
         <w:tc>
           <w:tcPr>
             <w:tcW w:w="2300" w:type="dxa"/>
@@ -4986,6 +4885,7 @@
           </w:tcPr>
           <w:p>
             <w:pPr>
+              <w:keepNext/>
               <w:spacing w:line="250" w:lineRule="auto"/>
             </w:pPr>
             <w:r>
@@ -5012,6 +4912,7 @@
           </w:tcPr>
           <w:p>
             <w:pPr>
+              <w:keepNext/>
               <w:spacing w:line="250" w:lineRule="auto"/>
             </w:pPr>
             <w:r>
@@ -5035,6 +4936,7 @@
           </w:tcPr>
           <w:p>
             <w:pPr>
+              <w:keepNext/>
               <w:spacing w:line="250" w:lineRule="auto"/>
             </w:pPr>
             <w:r>
@@ -5058,6 +4960,7 @@
           </w:tcPr>
           <w:p>
             <w:pPr>
+              <w:keepNext/>
               <w:spacing w:line="250" w:lineRule="auto"/>
             </w:pPr>
             <w:r>
@@ -5077,6 +4980,9 @@
             <w:bottom w:w="0" w:type="dxa"/>
           </w:tblCellMar>
         </w:tblPrEx>
+        <w:trPr>
+          <w:cantSplit/>
+        </w:trPr>
         <w:tc>
           <w:tcPr>
             <w:tcW w:w="2300" w:type="dxa"/>
@@ -5089,6 +4995,7 @@
           </w:tcPr>
           <w:p>
             <w:pPr>
+              <w:keepNext/>
               <w:spacing w:line="250" w:lineRule="auto"/>
             </w:pPr>
             <w:r>
@@ -5114,6 +5021,7 @@
           </w:tcPr>
           <w:p>
             <w:pPr>
+              <w:keepNext/>
               <w:spacing w:line="250" w:lineRule="auto"/>
             </w:pPr>
             <w:r>
@@ -5137,6 +5045,7 @@
           </w:tcPr>
           <w:p>
             <w:pPr>
+              <w:keepNext/>
               <w:spacing w:line="250" w:lineRule="auto"/>
             </w:pPr>
             <w:r>
@@ -5160,6 +5069,7 @@
           </w:tcPr>
           <w:p>
             <w:pPr>
+              <w:keepNext/>
               <w:spacing w:line="250" w:lineRule="auto"/>
             </w:pPr>
             <w:r>
@@ -5179,6 +5089,9 @@
             <w:bottom w:w="0" w:type="dxa"/>
           </w:tblCellMar>
         </w:tblPrEx>
+        <w:trPr>
+          <w:cantSplit/>
+        </w:trPr>
         <w:tc>
           <w:tcPr>
             <w:tcW w:w="2300" w:type="dxa"/>
@@ -5191,6 +5104,7 @@
           </w:tcPr>
           <w:p>
             <w:pPr>
+              <w:keepNext/>
               <w:spacing w:line="250" w:lineRule="auto"/>
             </w:pPr>
             <w:r>
@@ -5216,6 +5130,7 @@
           </w:tcPr>
           <w:p>
             <w:pPr>
+              <w:keepNext/>
               <w:spacing w:line="250" w:lineRule="auto"/>
             </w:pPr>
             <w:r>
@@ -5239,6 +5154,7 @@
           </w:tcPr>
           <w:p>
             <w:pPr>
+              <w:keepNext/>
               <w:spacing w:line="250" w:lineRule="auto"/>
             </w:pPr>
             <w:r>
@@ -5262,6 +5178,7 @@
           </w:tcPr>
           <w:p>
             <w:pPr>
+              <w:keepNext/>
               <w:spacing w:line="250" w:lineRule="auto"/>
             </w:pPr>
             <w:r>
@@ -5281,6 +5198,9 @@
             <w:bottom w:w="0" w:type="dxa"/>
           </w:tblCellMar>
         </w:tblPrEx>
+        <w:trPr>
+          <w:cantSplit/>
+        </w:trPr>
         <w:tc>
           <w:tcPr>
             <w:tcW w:w="2300" w:type="dxa"/>
@@ -5293,6 +5213,7 @@
           </w:tcPr>
           <w:p>
             <w:pPr>
+              <w:keepNext/>
               <w:spacing w:line="250" w:lineRule="auto"/>
             </w:pPr>
             <w:r>
@@ -5318,6 +5239,7 @@
           </w:tcPr>
           <w:p>
             <w:pPr>
+              <w:keepNext/>
               <w:spacing w:line="250" w:lineRule="auto"/>
             </w:pPr>
             <w:r>
@@ -5341,6 +5263,7 @@
           </w:tcPr>
           <w:p>
             <w:pPr>
+              <w:keepNext/>
               <w:spacing w:line="250" w:lineRule="auto"/>
             </w:pPr>
             <w:r>
@@ -5364,6 +5287,7 @@
           </w:tcPr>
           <w:p>
             <w:pPr>
+              <w:keepNext/>
               <w:spacing w:line="250" w:lineRule="auto"/>
             </w:pPr>
             <w:r>
@@ -5379,6 +5303,7 @@
     </w:tbl>
     <w:p>
       <w:pPr>
+        <w:keepLines/>
         <w:spacing w:after="220" w:line="300" w:lineRule="auto"/>
         <w:jc w:val="both"/>
       </w:pPr>
@@ -5423,7 +5348,7 @@
         <w:t xml:space="preserve">Minimum jerk. </w:t>
       </w:r>
       <w:r>
-        <w:t>The obvious approach is to solve two point-to-point problems and glue them together. Flash and Hogan showed that this is not the minimum-jerk answer. Getting the right one means returning to the optimization of §2 and adding the constraint properly, which is worth doing slowly.</w:t>
+        <w:t>The obvious approach is to solve two point-to-point problems and glue them together. Flash and Hogan showed that this is not the minimum-jerk answer. Getting the right one means returning to the optimization of §2 and adding the constraint properly, one step at a time.</w:t>
       </w:r>
     </w:p>
     <w:p>
@@ -5436,7 +5361,7 @@
           <w:i/>
           <w:iCs/>
         </w:rPr>
-        <w:t>If Lagrange multipliers are a distant memory, this is a good moment to review them.</w:t>
+        <w:t>If Lagrange multipliers are a distant memory, §4 of the Week 5 supplement reviews them with a worked example.</w:t>
       </w:r>
       <w:r>
         <w:t xml:space="preserve"> The idea in one sentence: to minimize f subject to a constraint g = 0, you do not restrict the search to the surface where g vanishes. You minimize f + λg over </w:t>
@@ -5571,6 +5496,7 @@
     </w:p>
     <w:p>
       <w:pPr>
+        <w:keepNext/>
         <w:spacing w:before="200" w:after="80"/>
         <w:jc w:val="center"/>
       </w:pPr>
@@ -5620,6 +5546,7 @@
     </w:p>
     <w:p>
       <w:pPr>
+        <w:keepLines/>
         <w:spacing w:after="200" w:line="260" w:lineRule="auto"/>
         <w:jc w:val="both"/>
       </w:pPr>
@@ -5705,7 +5632,7 @@
         <w:jc w:val="both"/>
       </w:pPr>
       <w:r>
-        <w:t xml:space="preserve">The constrained solution can be costed by hand too. The jerk cost is a sum of an x part and a y part. The constraints separate the same way, so each direction can be solved on its own.</w:t>
+        <w:t xml:space="preserve">The jerk cost of the constrained solution can also be worked out by hand. The jerk cost is a sum of an x part and a y part. The constraints separate the same way, so each direction can be solved on its own.</w:t>
       </w:r>
     </w:p>
     <w:p>
@@ -5919,7 +5846,7 @@
         <w:jc w:val="both"/>
       </w:pPr>
       <w:r>
-        <w:t xml:space="preserve">Both of those are testable claims rather than settled ones, and testing them is what HW05 asks you to do: sweep the dwell, sweep the switch time, and see how much of a penalty a badly chosen number carries in each case. It is worth going in without assuming the answer — a single switch </w:t>
+        <w:t xml:space="preserve">Both of those are testable claims rather than settled ones, and testing them is what HW05 asks you to do: sweep the dwell, sweep the switch time, and see how much of a penalty a badly chosen number carries in each case. Go in without assuming the answer. A single switch </w:t>
       </w:r>
       <w:r>
         <w:rPr>
@@ -6143,7 +6070,7 @@
         <w:t xml:space="preserve">Week 6 </w:t>
       </w:r>
       <w:r>
-        <w:t>executes the same task-space plan a different way — inverse dynamics and computed torque, with static optimization to resolve muscle redundancy. It gives the controller a full model of the arm’s dynamics, the knowledge that the timing correction at the end of §6 used only crudely. Make a prediction before you run it: with an exact model, how straight will the executed path be, and what happens when the model is wrong?</w:t>
+        <w:t xml:space="preserve">executes the same kind of plan with a controller that has an exact model of the arm: inverse dynamics and computed torque, with static optimization to resolve muscle redundancy. §6 executed the plans without such a model. Comparing the two shows what an internal model buys. Make a prediction before you run it: how straight will the executed path be?</w:t>
       </w:r>
     </w:p>
     <w:p>

</xml_diff>